<commit_message>
Ajout du module REC - Exercices récap
</commit_message>
<xml_diff>
--- a/documents/Codes_du_cours.docx
+++ b/documents/Codes_du_cours.docx
@@ -1310,7 +1310,7 @@
                 <w:sz w:val="20"/>
                 <w:szCs w:val="20"/>
               </w:rPr>
-              <w:t xml:space="preserve">7</w:t>
+              <w:t xml:space="preserve">8</w:t>
             </w:r>
           </w:p>
         </w:tc>
@@ -2000,7 +2000,7 @@
                 <w:sz w:val="20"/>
                 <w:szCs w:val="20"/>
               </w:rPr>
-              <w:t xml:space="preserve">Révision transversale avant l'examen</w:t>
+              <w:t xml:space="preserve">Deux séries de révision, dans la forme de l'examen</w:t>
             </w:r>
           </w:p>
         </w:tc>
@@ -2023,7 +2023,7 @@
                 <w:sz w:val="20"/>
                 <w:szCs w:val="20"/>
               </w:rPr>
-              <w:t xml:space="preserve">à définir</w:t>
+              <w:t xml:space="preserve">10</w:t>
             </w:r>
           </w:p>
         </w:tc>
@@ -4563,10 +4563,10 @@
     </w:tbl>
     <w:sectPr>
       <w:headerReference w:type="default" r:id="rId11"/>
-      <w:footerReference w:type="default" r:id="rId12"/>
+      <w:footerReference w:type="default" r:id="rId13"/>
       <w:pgSz w:w="11906" w:h="16838" w:orient="portrait"/>
       <w:pgMar w:top="1440" w:right="1440" w:bottom="1440" w:left="1440" w:header="708" w:footer="708" w:gutter="0"/>
-      <w:pgNumType/>
+      <w:pgNumType w:start="1"/>
       <w:docGrid w:linePitch="360"/>
     </w:sectPr>
   </w:body>
@@ -4612,6 +4612,67 @@
     </w:p>
   </w:endnote>
 </w:endnotes>
+</file>
+
+<file path=word/footer1.xml><?xml version="1.0" encoding="utf-8"?>
+<w:ftr xmlns:w="http://schemas.openxmlformats.org/wordprocessingml/2006/main">
+  <w:p>
+    <w:pPr>
+      <w:jc w:val="center"/>
+      <w:rPr>
+        <w:sz w:val="18"/>
+        <w:szCs w:val="18"/>
+        <w:color w:val="595959"/>
+      </w:rPr>
+    </w:pPr>
+    <w:r>
+      <w:rPr>
+        <w:sz w:val="18"/>
+        <w:szCs w:val="18"/>
+        <w:color w:val="595959"/>
+      </w:rPr>
+      <w:t xml:space="preserve">Codes </w:t>
+    </w:r>
+    <w:r>
+      <w:fldChar w:fldCharType="begin"/>
+    </w:r>
+    <w:r>
+      <w:instrText xml:space="preserve"> PAGE </w:instrText>
+    </w:r>
+    <w:r>
+      <w:fldChar w:fldCharType="separate"/>
+    </w:r>
+    <w:r>
+      <w:t>1</w:t>
+    </w:r>
+    <w:r>
+      <w:fldChar w:fldCharType="end"/>
+    </w:r>
+    <w:r>
+      <w:rPr>
+        <w:sz w:val="18"/>
+        <w:szCs w:val="18"/>
+        <w:color w:val="595959"/>
+      </w:rPr>
+      <w:t xml:space="preserve"> / </w:t>
+    </w:r>
+    <w:r>
+      <w:fldChar w:fldCharType="begin"/>
+    </w:r>
+    <w:r>
+      <w:instrText xml:space="preserve"> SECTIONPAGES </w:instrText>
+    </w:r>
+    <w:r>
+      <w:fldChar w:fldCharType="separate"/>
+    </w:r>
+    <w:r>
+      <w:t>4</w:t>
+    </w:r>
+    <w:r>
+      <w:fldChar w:fldCharType="end"/>
+    </w:r>
+  </w:p>
+</w:ftr>
 </file>
 
 <file path=word/footer_garde.xml><?xml version="1.0" encoding="utf-8"?>

</xml_diff>